<commit_message>
TC-105: fix document (remove right indentation)
</commit_message>
<xml_diff>
--- a/java-thesis-checker/src/test/resources/inherited_styles.docx
+++ b/java-thesis-checker/src/test/resources/inherited_styles.docx
@@ -6,7 +6,7 @@
       <w:pPr>
         <w:pStyle w:val="BodyText"/>
         <w:spacing w:line="360" w:lineRule="auto"/>
-        <w:ind w:right="419" w:firstLine="709"/>
+        <w:ind w:firstLine="709"/>
         <w:jc w:val="both"/>
         <w:rPr>
           <w:sz w:val="28"/>
@@ -387,7 +387,7 @@
           <w:tab w:val="left" w:pos="1134"/>
         </w:tabs>
         <w:spacing w:line="360" w:lineRule="auto"/>
-        <w:ind w:left="0" w:right="421" w:firstLine="709"/>
+        <w:ind w:left="0" w:firstLine="709"/>
         <w:rPr>
           <w:sz w:val="28"/>
           <w:szCs w:val="28"/>
@@ -444,7 +444,7 @@
           <w:tab w:val="left" w:pos="1134"/>
         </w:tabs>
         <w:spacing w:line="360" w:lineRule="auto"/>
-        <w:ind w:left="0" w:right="422" w:firstLine="709"/>
+        <w:ind w:left="0" w:firstLine="709"/>
         <w:rPr>
           <w:sz w:val="28"/>
           <w:szCs w:val="28"/>

</xml_diff>

<commit_message>
TC-41: implement list checker
</commit_message>
<xml_diff>
--- a/java-thesis-checker/src/test/resources/inherited_styles.docx
+++ b/java-thesis-checker/src/test/resources/inherited_styles.docx
@@ -1002,17 +1002,17 @@
   <w:abstractNum w:abstractNumId="2" w15:restartNumberingAfterBreak="0">
     <w:nsid w:val="1CA93492"/>
     <w:multiLevelType w:val="multilevel"/>
-    <w:tmpl w:val="E23CAD36"/>
+    <w:tmpl w:val="D4BCEF4A"/>
     <w:lvl w:ilvl="0">
       <w:start w:val="1"/>
       <w:numFmt w:val="decimal"/>
-      <w:lvlText w:val="%1."/>
-      <w:lvlJc w:val="left"/>
-      <w:pPr>
-        <w:ind w:left="851" w:hanging="425"/>
-      </w:pPr>
-      <w:rPr>
-        <w:rFonts w:ascii="Times New Roman" w:eastAsia="Times New Roman" w:hAnsi="Times New Roman" w:cs="Times New Roman" w:hint="default"/>
+      <w:lvlText w:val="%1)"/>
+      <w:lvlJc w:val="left"/>
+      <w:pPr>
+        <w:ind w:left="786" w:hanging="360"/>
+      </w:pPr>
+      <w:rPr>
+        <w:rFonts w:hint="default"/>
         <w:b w:val="0"/>
         <w:bCs w:val="0"/>
         <w:i w:val="0"/>

</xml_diff>

<commit_message>
TC-105: Check indentations (#52)
* TC-105: added test documents

* TC-105: fix document (remove right indentation)

* TC-105: added new checker for run

* TC-105: added model for contain indentation error

* TC-105: added indentation checker (left and right side)

* TC-105: fixed the category that is returned to clearly distinguish between indents and spacing

* TC-105: added requirement for indentations

* TC-105: remove unused method

* TC-105: added indent

* TC-105: rename variables
</commit_message>
<xml_diff>
--- a/java-thesis-checker/src/test/resources/inherited_styles.docx
+++ b/java-thesis-checker/src/test/resources/inherited_styles.docx
@@ -6,7 +6,7 @@
       <w:pPr>
         <w:pStyle w:val="BodyText"/>
         <w:spacing w:line="360" w:lineRule="auto"/>
-        <w:ind w:right="419" w:firstLine="709"/>
+        <w:ind w:firstLine="709"/>
         <w:jc w:val="both"/>
         <w:rPr>
           <w:sz w:val="28"/>
@@ -387,7 +387,7 @@
           <w:tab w:val="left" w:pos="1134"/>
         </w:tabs>
         <w:spacing w:line="360" w:lineRule="auto"/>
-        <w:ind w:left="0" w:right="421" w:firstLine="709"/>
+        <w:ind w:left="0" w:firstLine="709"/>
         <w:rPr>
           <w:sz w:val="28"/>
           <w:szCs w:val="28"/>
@@ -444,7 +444,7 @@
           <w:tab w:val="left" w:pos="1134"/>
         </w:tabs>
         <w:spacing w:line="360" w:lineRule="auto"/>
-        <w:ind w:left="0" w:right="422" w:firstLine="709"/>
+        <w:ind w:left="0" w:firstLine="709"/>
         <w:rPr>
           <w:sz w:val="28"/>
           <w:szCs w:val="28"/>

</xml_diff>

<commit_message>
TC-41: Implement list checker (#53)
* TC-41: implement list checker

* TC-41: moved import in header of file

* TC-41: correcting an incorrectly formatted test

* TC-41: fix document
</commit_message>
<xml_diff>
--- a/java-thesis-checker/src/test/resources/inherited_styles.docx
+++ b/java-thesis-checker/src/test/resources/inherited_styles.docx
@@ -1002,7 +1002,542 @@
   <w:abstractNum w:abstractNumId="2" w15:restartNumberingAfterBreak="0">
     <w:nsid w:val="1CA93492"/>
     <w:multiLevelType w:val="multilevel"/>
+    <w:tmpl w:val="0809001D"/>
+    <w:lvl w:ilvl="0">
+      <w:start w:val="1"/>
+      <w:numFmt w:val="decimal"/>
+      <w:lvlText w:val="%1)"/>
+      <w:lvlJc w:val="left"/>
+      <w:pPr>
+        <w:ind w:left="360" w:hanging="360"/>
+      </w:pPr>
+      <w:rPr>
+        <w:rFonts w:hint="default"/>
+        <w:b w:val="0"/>
+        <w:bCs w:val="0"/>
+        <w:i w:val="0"/>
+        <w:iCs w:val="0"/>
+        <w:spacing w:val="0"/>
+        <w:w w:val="100"/>
+        <w:sz w:val="28"/>
+        <w:szCs w:val="28"/>
+        <w:lang w:val="uk-UA" w:eastAsia="en-US" w:bidi="ar-SA"/>
+      </w:rPr>
+    </w:lvl>
+    <w:lvl w:ilvl="1">
+      <w:start w:val="1"/>
+      <w:numFmt w:val="lowerLetter"/>
+      <w:lvlText w:val="%2)"/>
+      <w:lvlJc w:val="left"/>
+      <w:pPr>
+        <w:ind w:left="720" w:hanging="360"/>
+      </w:pPr>
+      <w:rPr>
+        <w:rFonts w:hint="default"/>
+        <w:b/>
+        <w:bCs/>
+        <w:i w:val="0"/>
+        <w:iCs w:val="0"/>
+        <w:spacing w:val="0"/>
+        <w:w w:val="100"/>
+        <w:sz w:val="28"/>
+        <w:szCs w:val="28"/>
+        <w:lang w:val="uk-UA" w:eastAsia="en-US" w:bidi="ar-SA"/>
+      </w:rPr>
+    </w:lvl>
+    <w:lvl w:ilvl="2">
+      <w:start w:val="1"/>
+      <w:numFmt w:val="lowerRoman"/>
+      <w:lvlText w:val="%3)"/>
+      <w:lvlJc w:val="left"/>
+      <w:pPr>
+        <w:ind w:left="1080" w:hanging="360"/>
+      </w:pPr>
+      <w:rPr>
+        <w:rFonts w:hint="default"/>
+        <w:b w:val="0"/>
+        <w:bCs w:val="0"/>
+        <w:i w:val="0"/>
+        <w:iCs w:val="0"/>
+        <w:spacing w:val="0"/>
+        <w:w w:val="100"/>
+        <w:sz w:val="28"/>
+        <w:szCs w:val="28"/>
+        <w:lang w:val="uk-UA" w:eastAsia="en-US" w:bidi="ar-SA"/>
+      </w:rPr>
+    </w:lvl>
+    <w:lvl w:ilvl="3">
+      <w:start w:val="1"/>
+      <w:numFmt w:val="decimal"/>
+      <w:lvlText w:val="(%4)"/>
+      <w:lvlJc w:val="left"/>
+      <w:pPr>
+        <w:ind w:left="1440" w:hanging="360"/>
+      </w:pPr>
+      <w:rPr>
+        <w:rFonts w:hint="default"/>
+        <w:b w:val="0"/>
+        <w:bCs w:val="0"/>
+        <w:i w:val="0"/>
+        <w:iCs w:val="0"/>
+        <w:spacing w:val="-3"/>
+        <w:w w:val="100"/>
+        <w:sz w:val="28"/>
+        <w:szCs w:val="28"/>
+        <w:lang w:val="uk-UA" w:eastAsia="en-US" w:bidi="ar-SA"/>
+      </w:rPr>
+    </w:lvl>
+    <w:lvl w:ilvl="4">
+      <w:start w:val="1"/>
+      <w:numFmt w:val="lowerLetter"/>
+      <w:lvlText w:val="(%5)"/>
+      <w:lvlJc w:val="left"/>
+      <w:pPr>
+        <w:ind w:left="1800" w:hanging="360"/>
+      </w:pPr>
+      <w:rPr>
+        <w:rFonts w:hint="default"/>
+        <w:b w:val="0"/>
+        <w:bCs w:val="0"/>
+        <w:i w:val="0"/>
+        <w:iCs w:val="0"/>
+        <w:spacing w:val="0"/>
+        <w:w w:val="100"/>
+        <w:sz w:val="24"/>
+        <w:szCs w:val="24"/>
+        <w:lang w:val="uk-UA" w:eastAsia="en-US" w:bidi="ar-SA"/>
+      </w:rPr>
+    </w:lvl>
+    <w:lvl w:ilvl="5">
+      <w:start w:val="1"/>
+      <w:numFmt w:val="lowerRoman"/>
+      <w:lvlText w:val="(%6)"/>
+      <w:lvlJc w:val="left"/>
+      <w:pPr>
+        <w:ind w:left="2160" w:hanging="360"/>
+      </w:pPr>
+      <w:rPr>
+        <w:rFonts w:hint="default"/>
+        <w:b w:val="0"/>
+        <w:bCs w:val="0"/>
+        <w:i w:val="0"/>
+        <w:iCs w:val="0"/>
+        <w:spacing w:val="0"/>
+        <w:w w:val="100"/>
+        <w:sz w:val="24"/>
+        <w:szCs w:val="24"/>
+        <w:lang w:val="uk-UA" w:eastAsia="en-US" w:bidi="ar-SA"/>
+      </w:rPr>
+    </w:lvl>
+    <w:lvl w:ilvl="6">
+      <w:start w:val="1"/>
+      <w:numFmt w:val="decimal"/>
+      <w:lvlText w:val="%7."/>
+      <w:lvlJc w:val="left"/>
+      <w:pPr>
+        <w:ind w:left="2520" w:hanging="360"/>
+      </w:pPr>
+      <w:rPr>
+        <w:rFonts w:hint="default"/>
+        <w:lang w:val="uk-UA" w:eastAsia="en-US" w:bidi="ar-SA"/>
+      </w:rPr>
+    </w:lvl>
+    <w:lvl w:ilvl="7">
+      <w:start w:val="1"/>
+      <w:numFmt w:val="lowerLetter"/>
+      <w:lvlText w:val="%8."/>
+      <w:lvlJc w:val="left"/>
+      <w:pPr>
+        <w:ind w:left="2880" w:hanging="360"/>
+      </w:pPr>
+      <w:rPr>
+        <w:rFonts w:hint="default"/>
+        <w:lang w:val="uk-UA" w:eastAsia="en-US" w:bidi="ar-SA"/>
+      </w:rPr>
+    </w:lvl>
+    <w:lvl w:ilvl="8">
+      <w:start w:val="1"/>
+      <w:numFmt w:val="lowerRoman"/>
+      <w:lvlText w:val="%9."/>
+      <w:lvlJc w:val="left"/>
+      <w:pPr>
+        <w:ind w:left="3240" w:hanging="360"/>
+      </w:pPr>
+      <w:rPr>
+        <w:rFonts w:hint="default"/>
+        <w:lang w:val="uk-UA" w:eastAsia="en-US" w:bidi="ar-SA"/>
+      </w:rPr>
+    </w:lvl>
+  </w:abstractNum>
+  <w:abstractNum w:abstractNumId="3" w15:restartNumberingAfterBreak="0">
+    <w:nsid w:val="21E45865"/>
+    <w:multiLevelType w:val="hybridMultilevel"/>
+    <w:tmpl w:val="E490F352"/>
+    <w:lvl w:ilvl="0" w:tplc="54FE1AE0">
+      <w:start w:val="1"/>
+      <w:numFmt w:val="decimal"/>
+      <w:lvlText w:val="%1."/>
+      <w:lvlJc w:val="left"/>
+      <w:pPr>
+        <w:ind w:left="362" w:hanging="360"/>
+      </w:pPr>
+      <w:rPr>
+        <w:rFonts w:ascii="Times New Roman" w:eastAsia="Times New Roman" w:hAnsi="Times New Roman" w:cs="Times New Roman" w:hint="default"/>
+        <w:b w:val="0"/>
+        <w:bCs w:val="0"/>
+        <w:i w:val="0"/>
+        <w:iCs w:val="0"/>
+        <w:spacing w:val="0"/>
+        <w:w w:val="100"/>
+        <w:sz w:val="24"/>
+        <w:szCs w:val="24"/>
+        <w:lang w:val="uk-UA" w:eastAsia="en-US" w:bidi="ar-SA"/>
+      </w:rPr>
+    </w:lvl>
+    <w:lvl w:ilvl="1" w:tplc="80500898">
+      <w:numFmt w:val="bullet"/>
+      <w:lvlText w:val="•"/>
+      <w:lvlJc w:val="left"/>
+      <w:pPr>
+        <w:ind w:left="1302" w:hanging="360"/>
+      </w:pPr>
+      <w:rPr>
+        <w:rFonts w:hint="default"/>
+        <w:lang w:val="uk-UA" w:eastAsia="en-US" w:bidi="ar-SA"/>
+      </w:rPr>
+    </w:lvl>
+    <w:lvl w:ilvl="2" w:tplc="091CD762">
+      <w:numFmt w:val="bullet"/>
+      <w:lvlText w:val="•"/>
+      <w:lvlJc w:val="left"/>
+      <w:pPr>
+        <w:ind w:left="2244" w:hanging="360"/>
+      </w:pPr>
+      <w:rPr>
+        <w:rFonts w:hint="default"/>
+        <w:lang w:val="uk-UA" w:eastAsia="en-US" w:bidi="ar-SA"/>
+      </w:rPr>
+    </w:lvl>
+    <w:lvl w:ilvl="3" w:tplc="4DE00E1E">
+      <w:numFmt w:val="bullet"/>
+      <w:lvlText w:val="•"/>
+      <w:lvlJc w:val="left"/>
+      <w:pPr>
+        <w:ind w:left="3186" w:hanging="360"/>
+      </w:pPr>
+      <w:rPr>
+        <w:rFonts w:hint="default"/>
+        <w:lang w:val="uk-UA" w:eastAsia="en-US" w:bidi="ar-SA"/>
+      </w:rPr>
+    </w:lvl>
+    <w:lvl w:ilvl="4" w:tplc="E694427E">
+      <w:numFmt w:val="bullet"/>
+      <w:lvlText w:val="•"/>
+      <w:lvlJc w:val="left"/>
+      <w:pPr>
+        <w:ind w:left="4128" w:hanging="360"/>
+      </w:pPr>
+      <w:rPr>
+        <w:rFonts w:hint="default"/>
+        <w:lang w:val="uk-UA" w:eastAsia="en-US" w:bidi="ar-SA"/>
+      </w:rPr>
+    </w:lvl>
+    <w:lvl w:ilvl="5" w:tplc="448E7AAC">
+      <w:numFmt w:val="bullet"/>
+      <w:lvlText w:val="•"/>
+      <w:lvlJc w:val="left"/>
+      <w:pPr>
+        <w:ind w:left="5070" w:hanging="360"/>
+      </w:pPr>
+      <w:rPr>
+        <w:rFonts w:hint="default"/>
+        <w:lang w:val="uk-UA" w:eastAsia="en-US" w:bidi="ar-SA"/>
+      </w:rPr>
+    </w:lvl>
+    <w:lvl w:ilvl="6" w:tplc="8378193E">
+      <w:numFmt w:val="bullet"/>
+      <w:lvlText w:val="•"/>
+      <w:lvlJc w:val="left"/>
+      <w:pPr>
+        <w:ind w:left="6012" w:hanging="360"/>
+      </w:pPr>
+      <w:rPr>
+        <w:rFonts w:hint="default"/>
+        <w:lang w:val="uk-UA" w:eastAsia="en-US" w:bidi="ar-SA"/>
+      </w:rPr>
+    </w:lvl>
+    <w:lvl w:ilvl="7" w:tplc="BEF096C4">
+      <w:numFmt w:val="bullet"/>
+      <w:lvlText w:val="•"/>
+      <w:lvlJc w:val="left"/>
+      <w:pPr>
+        <w:ind w:left="6954" w:hanging="360"/>
+      </w:pPr>
+      <w:rPr>
+        <w:rFonts w:hint="default"/>
+        <w:lang w:val="uk-UA" w:eastAsia="en-US" w:bidi="ar-SA"/>
+      </w:rPr>
+    </w:lvl>
+    <w:lvl w:ilvl="8" w:tplc="64C2EDAC">
+      <w:numFmt w:val="bullet"/>
+      <w:lvlText w:val="•"/>
+      <w:lvlJc w:val="left"/>
+      <w:pPr>
+        <w:ind w:left="7897" w:hanging="360"/>
+      </w:pPr>
+      <w:rPr>
+        <w:rFonts w:hint="default"/>
+        <w:lang w:val="uk-UA" w:eastAsia="en-US" w:bidi="ar-SA"/>
+      </w:rPr>
+    </w:lvl>
+  </w:abstractNum>
+  <w:abstractNum w:abstractNumId="4" w15:restartNumberingAfterBreak="0">
+    <w:nsid w:val="3A686A2F"/>
+    <w:multiLevelType w:val="hybridMultilevel"/>
+    <w:tmpl w:val="BF3E2BAC"/>
+    <w:lvl w:ilvl="0" w:tplc="E0C0B63A">
+      <w:numFmt w:val="bullet"/>
+      <w:lvlText w:val=""/>
+      <w:lvlJc w:val="left"/>
+      <w:pPr>
+        <w:ind w:left="1134" w:hanging="425"/>
+      </w:pPr>
+      <w:rPr>
+        <w:rFonts w:ascii="Symbol" w:eastAsia="Symbol" w:hAnsi="Symbol" w:cs="Symbol" w:hint="default"/>
+        <w:b w:val="0"/>
+        <w:bCs w:val="0"/>
+        <w:i w:val="0"/>
+        <w:iCs w:val="0"/>
+        <w:spacing w:val="0"/>
+        <w:w w:val="100"/>
+        <w:sz w:val="24"/>
+        <w:szCs w:val="24"/>
+        <w:lang w:val="uk-UA" w:eastAsia="en-US" w:bidi="ar-SA"/>
+      </w:rPr>
+    </w:lvl>
+    <w:lvl w:ilvl="1" w:tplc="62A0260E">
+      <w:numFmt w:val="bullet"/>
+      <w:lvlText w:val="•"/>
+      <w:lvlJc w:val="left"/>
+      <w:pPr>
+        <w:ind w:left="2004" w:hanging="425"/>
+      </w:pPr>
+      <w:rPr>
+        <w:rFonts w:hint="default"/>
+        <w:lang w:val="uk-UA" w:eastAsia="en-US" w:bidi="ar-SA"/>
+      </w:rPr>
+    </w:lvl>
+    <w:lvl w:ilvl="2" w:tplc="523426C4">
+      <w:numFmt w:val="bullet"/>
+      <w:lvlText w:val="•"/>
+      <w:lvlJc w:val="left"/>
+      <w:pPr>
+        <w:ind w:left="2868" w:hanging="425"/>
+      </w:pPr>
+      <w:rPr>
+        <w:rFonts w:hint="default"/>
+        <w:lang w:val="uk-UA" w:eastAsia="en-US" w:bidi="ar-SA"/>
+      </w:rPr>
+    </w:lvl>
+    <w:lvl w:ilvl="3" w:tplc="72326238">
+      <w:numFmt w:val="bullet"/>
+      <w:lvlText w:val="•"/>
+      <w:lvlJc w:val="left"/>
+      <w:pPr>
+        <w:ind w:left="3732" w:hanging="425"/>
+      </w:pPr>
+      <w:rPr>
+        <w:rFonts w:hint="default"/>
+        <w:lang w:val="uk-UA" w:eastAsia="en-US" w:bidi="ar-SA"/>
+      </w:rPr>
+    </w:lvl>
+    <w:lvl w:ilvl="4" w:tplc="9B047C64">
+      <w:numFmt w:val="bullet"/>
+      <w:lvlText w:val="•"/>
+      <w:lvlJc w:val="left"/>
+      <w:pPr>
+        <w:ind w:left="4596" w:hanging="425"/>
+      </w:pPr>
+      <w:rPr>
+        <w:rFonts w:hint="default"/>
+        <w:lang w:val="uk-UA" w:eastAsia="en-US" w:bidi="ar-SA"/>
+      </w:rPr>
+    </w:lvl>
+    <w:lvl w:ilvl="5" w:tplc="71042324">
+      <w:numFmt w:val="bullet"/>
+      <w:lvlText w:val="•"/>
+      <w:lvlJc w:val="left"/>
+      <w:pPr>
+        <w:ind w:left="5460" w:hanging="425"/>
+      </w:pPr>
+      <w:rPr>
+        <w:rFonts w:hint="default"/>
+        <w:lang w:val="uk-UA" w:eastAsia="en-US" w:bidi="ar-SA"/>
+      </w:rPr>
+    </w:lvl>
+    <w:lvl w:ilvl="6" w:tplc="8848C0B6">
+      <w:numFmt w:val="bullet"/>
+      <w:lvlText w:val="•"/>
+      <w:lvlJc w:val="left"/>
+      <w:pPr>
+        <w:ind w:left="6324" w:hanging="425"/>
+      </w:pPr>
+      <w:rPr>
+        <w:rFonts w:hint="default"/>
+        <w:lang w:val="uk-UA" w:eastAsia="en-US" w:bidi="ar-SA"/>
+      </w:rPr>
+    </w:lvl>
+    <w:lvl w:ilvl="7" w:tplc="A432B5F4">
+      <w:numFmt w:val="bullet"/>
+      <w:lvlText w:val="•"/>
+      <w:lvlJc w:val="left"/>
+      <w:pPr>
+        <w:ind w:left="7188" w:hanging="425"/>
+      </w:pPr>
+      <w:rPr>
+        <w:rFonts w:hint="default"/>
+        <w:lang w:val="uk-UA" w:eastAsia="en-US" w:bidi="ar-SA"/>
+      </w:rPr>
+    </w:lvl>
+    <w:lvl w:ilvl="8" w:tplc="CAC2314A">
+      <w:numFmt w:val="bullet"/>
+      <w:lvlText w:val="•"/>
+      <w:lvlJc w:val="left"/>
+      <w:pPr>
+        <w:ind w:left="8053" w:hanging="425"/>
+      </w:pPr>
+      <w:rPr>
+        <w:rFonts w:hint="default"/>
+        <w:lang w:val="uk-UA" w:eastAsia="en-US" w:bidi="ar-SA"/>
+      </w:rPr>
+    </w:lvl>
+  </w:abstractNum>
+  <w:abstractNum w:abstractNumId="5" w15:restartNumberingAfterBreak="0">
+    <w:nsid w:val="4F9A17FD"/>
+    <w:multiLevelType w:val="hybridMultilevel"/>
+    <w:tmpl w:val="DE2248EA"/>
+    <w:lvl w:ilvl="0" w:tplc="8546518A">
+      <w:numFmt w:val="bullet"/>
+      <w:lvlText w:val=""/>
+      <w:lvlJc w:val="left"/>
+      <w:pPr>
+        <w:ind w:left="1134" w:hanging="425"/>
+      </w:pPr>
+      <w:rPr>
+        <w:rFonts w:ascii="Symbol" w:eastAsia="Symbol" w:hAnsi="Symbol" w:cs="Symbol" w:hint="default"/>
+        <w:b w:val="0"/>
+        <w:bCs w:val="0"/>
+        <w:i w:val="0"/>
+        <w:iCs w:val="0"/>
+        <w:spacing w:val="0"/>
+        <w:w w:val="99"/>
+        <w:sz w:val="20"/>
+        <w:szCs w:val="20"/>
+        <w:lang w:val="uk-UA" w:eastAsia="en-US" w:bidi="ar-SA"/>
+      </w:rPr>
+    </w:lvl>
+    <w:lvl w:ilvl="1" w:tplc="9C8C35C8">
+      <w:numFmt w:val="bullet"/>
+      <w:lvlText w:val="•"/>
+      <w:lvlJc w:val="left"/>
+      <w:pPr>
+        <w:ind w:left="2004" w:hanging="425"/>
+      </w:pPr>
+      <w:rPr>
+        <w:rFonts w:hint="default"/>
+        <w:lang w:val="uk-UA" w:eastAsia="en-US" w:bidi="ar-SA"/>
+      </w:rPr>
+    </w:lvl>
+    <w:lvl w:ilvl="2" w:tplc="97A4F160">
+      <w:numFmt w:val="bullet"/>
+      <w:lvlText w:val="•"/>
+      <w:lvlJc w:val="left"/>
+      <w:pPr>
+        <w:ind w:left="2868" w:hanging="425"/>
+      </w:pPr>
+      <w:rPr>
+        <w:rFonts w:hint="default"/>
+        <w:lang w:val="uk-UA" w:eastAsia="en-US" w:bidi="ar-SA"/>
+      </w:rPr>
+    </w:lvl>
+    <w:lvl w:ilvl="3" w:tplc="BA247E66">
+      <w:numFmt w:val="bullet"/>
+      <w:lvlText w:val="•"/>
+      <w:lvlJc w:val="left"/>
+      <w:pPr>
+        <w:ind w:left="3732" w:hanging="425"/>
+      </w:pPr>
+      <w:rPr>
+        <w:rFonts w:hint="default"/>
+        <w:lang w:val="uk-UA" w:eastAsia="en-US" w:bidi="ar-SA"/>
+      </w:rPr>
+    </w:lvl>
+    <w:lvl w:ilvl="4" w:tplc="A7B8E30C">
+      <w:numFmt w:val="bullet"/>
+      <w:lvlText w:val="•"/>
+      <w:lvlJc w:val="left"/>
+      <w:pPr>
+        <w:ind w:left="4596" w:hanging="425"/>
+      </w:pPr>
+      <w:rPr>
+        <w:rFonts w:hint="default"/>
+        <w:lang w:val="uk-UA" w:eastAsia="en-US" w:bidi="ar-SA"/>
+      </w:rPr>
+    </w:lvl>
+    <w:lvl w:ilvl="5" w:tplc="CC6E4A1C">
+      <w:numFmt w:val="bullet"/>
+      <w:lvlText w:val="•"/>
+      <w:lvlJc w:val="left"/>
+      <w:pPr>
+        <w:ind w:left="5460" w:hanging="425"/>
+      </w:pPr>
+      <w:rPr>
+        <w:rFonts w:hint="default"/>
+        <w:lang w:val="uk-UA" w:eastAsia="en-US" w:bidi="ar-SA"/>
+      </w:rPr>
+    </w:lvl>
+    <w:lvl w:ilvl="6" w:tplc="7A604546">
+      <w:numFmt w:val="bullet"/>
+      <w:lvlText w:val="•"/>
+      <w:lvlJc w:val="left"/>
+      <w:pPr>
+        <w:ind w:left="6324" w:hanging="425"/>
+      </w:pPr>
+      <w:rPr>
+        <w:rFonts w:hint="default"/>
+        <w:lang w:val="uk-UA" w:eastAsia="en-US" w:bidi="ar-SA"/>
+      </w:rPr>
+    </w:lvl>
+    <w:lvl w:ilvl="7" w:tplc="24B0B53A">
+      <w:numFmt w:val="bullet"/>
+      <w:lvlText w:val="•"/>
+      <w:lvlJc w:val="left"/>
+      <w:pPr>
+        <w:ind w:left="7188" w:hanging="425"/>
+      </w:pPr>
+      <w:rPr>
+        <w:rFonts w:hint="default"/>
+        <w:lang w:val="uk-UA" w:eastAsia="en-US" w:bidi="ar-SA"/>
+      </w:rPr>
+    </w:lvl>
+    <w:lvl w:ilvl="8" w:tplc="0324D404">
+      <w:numFmt w:val="bullet"/>
+      <w:lvlText w:val="•"/>
+      <w:lvlJc w:val="left"/>
+      <w:pPr>
+        <w:ind w:left="8053" w:hanging="425"/>
+      </w:pPr>
+      <w:rPr>
+        <w:rFonts w:hint="default"/>
+        <w:lang w:val="uk-UA" w:eastAsia="en-US" w:bidi="ar-SA"/>
+      </w:rPr>
+    </w:lvl>
+  </w:abstractNum>
+  <w:abstractNum w:abstractNumId="6" w15:restartNumberingAfterBreak="0">
+    <w:nsid w:val="53B92065"/>
+    <w:multiLevelType w:val="multilevel"/>
     <w:tmpl w:val="E23CAD36"/>
+    <w:styleLink w:val="CurrentList1"/>
     <w:lvl w:ilvl="0">
       <w:start w:val="1"/>
       <w:numFmt w:val="decimal"/>
@@ -1159,370 +1694,6 @@
       <w:lvlJc w:val="left"/>
       <w:pPr>
         <w:ind w:left="7304" w:hanging="428"/>
-      </w:pPr>
-      <w:rPr>
-        <w:rFonts w:hint="default"/>
-        <w:lang w:val="uk-UA" w:eastAsia="en-US" w:bidi="ar-SA"/>
-      </w:rPr>
-    </w:lvl>
-  </w:abstractNum>
-  <w:abstractNum w:abstractNumId="3" w15:restartNumberingAfterBreak="0">
-    <w:nsid w:val="21E45865"/>
-    <w:multiLevelType w:val="hybridMultilevel"/>
-    <w:tmpl w:val="E490F352"/>
-    <w:lvl w:ilvl="0" w:tplc="54FE1AE0">
-      <w:start w:val="1"/>
-      <w:numFmt w:val="decimal"/>
-      <w:lvlText w:val="%1."/>
-      <w:lvlJc w:val="left"/>
-      <w:pPr>
-        <w:ind w:left="362" w:hanging="360"/>
-      </w:pPr>
-      <w:rPr>
-        <w:rFonts w:ascii="Times New Roman" w:eastAsia="Times New Roman" w:hAnsi="Times New Roman" w:cs="Times New Roman" w:hint="default"/>
-        <w:b w:val="0"/>
-        <w:bCs w:val="0"/>
-        <w:i w:val="0"/>
-        <w:iCs w:val="0"/>
-        <w:spacing w:val="0"/>
-        <w:w w:val="100"/>
-        <w:sz w:val="24"/>
-        <w:szCs w:val="24"/>
-        <w:lang w:val="uk-UA" w:eastAsia="en-US" w:bidi="ar-SA"/>
-      </w:rPr>
-    </w:lvl>
-    <w:lvl w:ilvl="1" w:tplc="80500898">
-      <w:numFmt w:val="bullet"/>
-      <w:lvlText w:val="•"/>
-      <w:lvlJc w:val="left"/>
-      <w:pPr>
-        <w:ind w:left="1302" w:hanging="360"/>
-      </w:pPr>
-      <w:rPr>
-        <w:rFonts w:hint="default"/>
-        <w:lang w:val="uk-UA" w:eastAsia="en-US" w:bidi="ar-SA"/>
-      </w:rPr>
-    </w:lvl>
-    <w:lvl w:ilvl="2" w:tplc="091CD762">
-      <w:numFmt w:val="bullet"/>
-      <w:lvlText w:val="•"/>
-      <w:lvlJc w:val="left"/>
-      <w:pPr>
-        <w:ind w:left="2244" w:hanging="360"/>
-      </w:pPr>
-      <w:rPr>
-        <w:rFonts w:hint="default"/>
-        <w:lang w:val="uk-UA" w:eastAsia="en-US" w:bidi="ar-SA"/>
-      </w:rPr>
-    </w:lvl>
-    <w:lvl w:ilvl="3" w:tplc="4DE00E1E">
-      <w:numFmt w:val="bullet"/>
-      <w:lvlText w:val="•"/>
-      <w:lvlJc w:val="left"/>
-      <w:pPr>
-        <w:ind w:left="3186" w:hanging="360"/>
-      </w:pPr>
-      <w:rPr>
-        <w:rFonts w:hint="default"/>
-        <w:lang w:val="uk-UA" w:eastAsia="en-US" w:bidi="ar-SA"/>
-      </w:rPr>
-    </w:lvl>
-    <w:lvl w:ilvl="4" w:tplc="E694427E">
-      <w:numFmt w:val="bullet"/>
-      <w:lvlText w:val="•"/>
-      <w:lvlJc w:val="left"/>
-      <w:pPr>
-        <w:ind w:left="4128" w:hanging="360"/>
-      </w:pPr>
-      <w:rPr>
-        <w:rFonts w:hint="default"/>
-        <w:lang w:val="uk-UA" w:eastAsia="en-US" w:bidi="ar-SA"/>
-      </w:rPr>
-    </w:lvl>
-    <w:lvl w:ilvl="5" w:tplc="448E7AAC">
-      <w:numFmt w:val="bullet"/>
-      <w:lvlText w:val="•"/>
-      <w:lvlJc w:val="left"/>
-      <w:pPr>
-        <w:ind w:left="5070" w:hanging="360"/>
-      </w:pPr>
-      <w:rPr>
-        <w:rFonts w:hint="default"/>
-        <w:lang w:val="uk-UA" w:eastAsia="en-US" w:bidi="ar-SA"/>
-      </w:rPr>
-    </w:lvl>
-    <w:lvl w:ilvl="6" w:tplc="8378193E">
-      <w:numFmt w:val="bullet"/>
-      <w:lvlText w:val="•"/>
-      <w:lvlJc w:val="left"/>
-      <w:pPr>
-        <w:ind w:left="6012" w:hanging="360"/>
-      </w:pPr>
-      <w:rPr>
-        <w:rFonts w:hint="default"/>
-        <w:lang w:val="uk-UA" w:eastAsia="en-US" w:bidi="ar-SA"/>
-      </w:rPr>
-    </w:lvl>
-    <w:lvl w:ilvl="7" w:tplc="BEF096C4">
-      <w:numFmt w:val="bullet"/>
-      <w:lvlText w:val="•"/>
-      <w:lvlJc w:val="left"/>
-      <w:pPr>
-        <w:ind w:left="6954" w:hanging="360"/>
-      </w:pPr>
-      <w:rPr>
-        <w:rFonts w:hint="default"/>
-        <w:lang w:val="uk-UA" w:eastAsia="en-US" w:bidi="ar-SA"/>
-      </w:rPr>
-    </w:lvl>
-    <w:lvl w:ilvl="8" w:tplc="64C2EDAC">
-      <w:numFmt w:val="bullet"/>
-      <w:lvlText w:val="•"/>
-      <w:lvlJc w:val="left"/>
-      <w:pPr>
-        <w:ind w:left="7897" w:hanging="360"/>
-      </w:pPr>
-      <w:rPr>
-        <w:rFonts w:hint="default"/>
-        <w:lang w:val="uk-UA" w:eastAsia="en-US" w:bidi="ar-SA"/>
-      </w:rPr>
-    </w:lvl>
-  </w:abstractNum>
-  <w:abstractNum w:abstractNumId="4" w15:restartNumberingAfterBreak="0">
-    <w:nsid w:val="3A686A2F"/>
-    <w:multiLevelType w:val="hybridMultilevel"/>
-    <w:tmpl w:val="BF3E2BAC"/>
-    <w:lvl w:ilvl="0" w:tplc="E0C0B63A">
-      <w:numFmt w:val="bullet"/>
-      <w:lvlText w:val=""/>
-      <w:lvlJc w:val="left"/>
-      <w:pPr>
-        <w:ind w:left="1134" w:hanging="425"/>
-      </w:pPr>
-      <w:rPr>
-        <w:rFonts w:ascii="Symbol" w:eastAsia="Symbol" w:hAnsi="Symbol" w:cs="Symbol" w:hint="default"/>
-        <w:b w:val="0"/>
-        <w:bCs w:val="0"/>
-        <w:i w:val="0"/>
-        <w:iCs w:val="0"/>
-        <w:spacing w:val="0"/>
-        <w:w w:val="100"/>
-        <w:sz w:val="24"/>
-        <w:szCs w:val="24"/>
-        <w:lang w:val="uk-UA" w:eastAsia="en-US" w:bidi="ar-SA"/>
-      </w:rPr>
-    </w:lvl>
-    <w:lvl w:ilvl="1" w:tplc="62A0260E">
-      <w:numFmt w:val="bullet"/>
-      <w:lvlText w:val="•"/>
-      <w:lvlJc w:val="left"/>
-      <w:pPr>
-        <w:ind w:left="2004" w:hanging="425"/>
-      </w:pPr>
-      <w:rPr>
-        <w:rFonts w:hint="default"/>
-        <w:lang w:val="uk-UA" w:eastAsia="en-US" w:bidi="ar-SA"/>
-      </w:rPr>
-    </w:lvl>
-    <w:lvl w:ilvl="2" w:tplc="523426C4">
-      <w:numFmt w:val="bullet"/>
-      <w:lvlText w:val="•"/>
-      <w:lvlJc w:val="left"/>
-      <w:pPr>
-        <w:ind w:left="2868" w:hanging="425"/>
-      </w:pPr>
-      <w:rPr>
-        <w:rFonts w:hint="default"/>
-        <w:lang w:val="uk-UA" w:eastAsia="en-US" w:bidi="ar-SA"/>
-      </w:rPr>
-    </w:lvl>
-    <w:lvl w:ilvl="3" w:tplc="72326238">
-      <w:numFmt w:val="bullet"/>
-      <w:lvlText w:val="•"/>
-      <w:lvlJc w:val="left"/>
-      <w:pPr>
-        <w:ind w:left="3732" w:hanging="425"/>
-      </w:pPr>
-      <w:rPr>
-        <w:rFonts w:hint="default"/>
-        <w:lang w:val="uk-UA" w:eastAsia="en-US" w:bidi="ar-SA"/>
-      </w:rPr>
-    </w:lvl>
-    <w:lvl w:ilvl="4" w:tplc="9B047C64">
-      <w:numFmt w:val="bullet"/>
-      <w:lvlText w:val="•"/>
-      <w:lvlJc w:val="left"/>
-      <w:pPr>
-        <w:ind w:left="4596" w:hanging="425"/>
-      </w:pPr>
-      <w:rPr>
-        <w:rFonts w:hint="default"/>
-        <w:lang w:val="uk-UA" w:eastAsia="en-US" w:bidi="ar-SA"/>
-      </w:rPr>
-    </w:lvl>
-    <w:lvl w:ilvl="5" w:tplc="71042324">
-      <w:numFmt w:val="bullet"/>
-      <w:lvlText w:val="•"/>
-      <w:lvlJc w:val="left"/>
-      <w:pPr>
-        <w:ind w:left="5460" w:hanging="425"/>
-      </w:pPr>
-      <w:rPr>
-        <w:rFonts w:hint="default"/>
-        <w:lang w:val="uk-UA" w:eastAsia="en-US" w:bidi="ar-SA"/>
-      </w:rPr>
-    </w:lvl>
-    <w:lvl w:ilvl="6" w:tplc="8848C0B6">
-      <w:numFmt w:val="bullet"/>
-      <w:lvlText w:val="•"/>
-      <w:lvlJc w:val="left"/>
-      <w:pPr>
-        <w:ind w:left="6324" w:hanging="425"/>
-      </w:pPr>
-      <w:rPr>
-        <w:rFonts w:hint="default"/>
-        <w:lang w:val="uk-UA" w:eastAsia="en-US" w:bidi="ar-SA"/>
-      </w:rPr>
-    </w:lvl>
-    <w:lvl w:ilvl="7" w:tplc="A432B5F4">
-      <w:numFmt w:val="bullet"/>
-      <w:lvlText w:val="•"/>
-      <w:lvlJc w:val="left"/>
-      <w:pPr>
-        <w:ind w:left="7188" w:hanging="425"/>
-      </w:pPr>
-      <w:rPr>
-        <w:rFonts w:hint="default"/>
-        <w:lang w:val="uk-UA" w:eastAsia="en-US" w:bidi="ar-SA"/>
-      </w:rPr>
-    </w:lvl>
-    <w:lvl w:ilvl="8" w:tplc="CAC2314A">
-      <w:numFmt w:val="bullet"/>
-      <w:lvlText w:val="•"/>
-      <w:lvlJc w:val="left"/>
-      <w:pPr>
-        <w:ind w:left="8053" w:hanging="425"/>
-      </w:pPr>
-      <w:rPr>
-        <w:rFonts w:hint="default"/>
-        <w:lang w:val="uk-UA" w:eastAsia="en-US" w:bidi="ar-SA"/>
-      </w:rPr>
-    </w:lvl>
-  </w:abstractNum>
-  <w:abstractNum w:abstractNumId="5" w15:restartNumberingAfterBreak="0">
-    <w:nsid w:val="4F9A17FD"/>
-    <w:multiLevelType w:val="hybridMultilevel"/>
-    <w:tmpl w:val="DE2248EA"/>
-    <w:lvl w:ilvl="0" w:tplc="8546518A">
-      <w:numFmt w:val="bullet"/>
-      <w:lvlText w:val=""/>
-      <w:lvlJc w:val="left"/>
-      <w:pPr>
-        <w:ind w:left="1134" w:hanging="425"/>
-      </w:pPr>
-      <w:rPr>
-        <w:rFonts w:ascii="Symbol" w:eastAsia="Symbol" w:hAnsi="Symbol" w:cs="Symbol" w:hint="default"/>
-        <w:b w:val="0"/>
-        <w:bCs w:val="0"/>
-        <w:i w:val="0"/>
-        <w:iCs w:val="0"/>
-        <w:spacing w:val="0"/>
-        <w:w w:val="99"/>
-        <w:sz w:val="20"/>
-        <w:szCs w:val="20"/>
-        <w:lang w:val="uk-UA" w:eastAsia="en-US" w:bidi="ar-SA"/>
-      </w:rPr>
-    </w:lvl>
-    <w:lvl w:ilvl="1" w:tplc="9C8C35C8">
-      <w:numFmt w:val="bullet"/>
-      <w:lvlText w:val="•"/>
-      <w:lvlJc w:val="left"/>
-      <w:pPr>
-        <w:ind w:left="2004" w:hanging="425"/>
-      </w:pPr>
-      <w:rPr>
-        <w:rFonts w:hint="default"/>
-        <w:lang w:val="uk-UA" w:eastAsia="en-US" w:bidi="ar-SA"/>
-      </w:rPr>
-    </w:lvl>
-    <w:lvl w:ilvl="2" w:tplc="97A4F160">
-      <w:numFmt w:val="bullet"/>
-      <w:lvlText w:val="•"/>
-      <w:lvlJc w:val="left"/>
-      <w:pPr>
-        <w:ind w:left="2868" w:hanging="425"/>
-      </w:pPr>
-      <w:rPr>
-        <w:rFonts w:hint="default"/>
-        <w:lang w:val="uk-UA" w:eastAsia="en-US" w:bidi="ar-SA"/>
-      </w:rPr>
-    </w:lvl>
-    <w:lvl w:ilvl="3" w:tplc="BA247E66">
-      <w:numFmt w:val="bullet"/>
-      <w:lvlText w:val="•"/>
-      <w:lvlJc w:val="left"/>
-      <w:pPr>
-        <w:ind w:left="3732" w:hanging="425"/>
-      </w:pPr>
-      <w:rPr>
-        <w:rFonts w:hint="default"/>
-        <w:lang w:val="uk-UA" w:eastAsia="en-US" w:bidi="ar-SA"/>
-      </w:rPr>
-    </w:lvl>
-    <w:lvl w:ilvl="4" w:tplc="A7B8E30C">
-      <w:numFmt w:val="bullet"/>
-      <w:lvlText w:val="•"/>
-      <w:lvlJc w:val="left"/>
-      <w:pPr>
-        <w:ind w:left="4596" w:hanging="425"/>
-      </w:pPr>
-      <w:rPr>
-        <w:rFonts w:hint="default"/>
-        <w:lang w:val="uk-UA" w:eastAsia="en-US" w:bidi="ar-SA"/>
-      </w:rPr>
-    </w:lvl>
-    <w:lvl w:ilvl="5" w:tplc="CC6E4A1C">
-      <w:numFmt w:val="bullet"/>
-      <w:lvlText w:val="•"/>
-      <w:lvlJc w:val="left"/>
-      <w:pPr>
-        <w:ind w:left="5460" w:hanging="425"/>
-      </w:pPr>
-      <w:rPr>
-        <w:rFonts w:hint="default"/>
-        <w:lang w:val="uk-UA" w:eastAsia="en-US" w:bidi="ar-SA"/>
-      </w:rPr>
-    </w:lvl>
-    <w:lvl w:ilvl="6" w:tplc="7A604546">
-      <w:numFmt w:val="bullet"/>
-      <w:lvlText w:val="•"/>
-      <w:lvlJc w:val="left"/>
-      <w:pPr>
-        <w:ind w:left="6324" w:hanging="425"/>
-      </w:pPr>
-      <w:rPr>
-        <w:rFonts w:hint="default"/>
-        <w:lang w:val="uk-UA" w:eastAsia="en-US" w:bidi="ar-SA"/>
-      </w:rPr>
-    </w:lvl>
-    <w:lvl w:ilvl="7" w:tplc="24B0B53A">
-      <w:numFmt w:val="bullet"/>
-      <w:lvlText w:val="•"/>
-      <w:lvlJc w:val="left"/>
-      <w:pPr>
-        <w:ind w:left="7188" w:hanging="425"/>
-      </w:pPr>
-      <w:rPr>
-        <w:rFonts w:hint="default"/>
-        <w:lang w:val="uk-UA" w:eastAsia="en-US" w:bidi="ar-SA"/>
-      </w:rPr>
-    </w:lvl>
-    <w:lvl w:ilvl="8" w:tplc="0324D404">
-      <w:numFmt w:val="bullet"/>
-      <w:lvlText w:val="•"/>
-      <w:lvlJc w:val="left"/>
-      <w:pPr>
-        <w:ind w:left="8053" w:hanging="425"/>
       </w:pPr>
       <w:rPr>
         <w:rFonts w:hint="default"/>
@@ -1547,6 +1718,9 @@
   </w:num>
   <w:num w:numId="6" w16cid:durableId="756949521">
     <w:abstractNumId w:val="1"/>
+  </w:num>
+  <w:num w:numId="7" w16cid:durableId="1849632429">
+    <w:abstractNumId w:val="6"/>
   </w:num>
 </w:numbering>
 </file>
@@ -2120,6 +2294,16 @@
     <w:uiPriority w:val="1"/>
     <w:qFormat/>
   </w:style>
+  <w:style w:type="numbering" w:customStyle="1" w:styleId="CurrentList1">
+    <w:name w:val="Current List1"/>
+    <w:uiPriority w:val="99"/>
+    <w:rsid w:val="004A5845"/>
+    <w:pPr>
+      <w:numPr>
+        <w:numId w:val="7"/>
+      </w:numPr>
+    </w:pPr>
+  </w:style>
 </w:styles>
 </file>
 

</xml_diff>

<commit_message>
TC-58: added checking of the location of structural elements in the document
</commit_message>
<xml_diff>
--- a/java-thesis-checker/src/test/resources/inherited_styles.docx
+++ b/java-thesis-checker/src/test/resources/inherited_styles.docx
@@ -520,6 +520,122 @@
           <w:szCs w:val="28"/>
         </w:rPr>
         <w:t>-режимі.</w:t>
+      </w:r>
+    </w:p>
+    <w:p>
+      <w:pPr>
+        <w:pStyle w:val="Heading1"/>
+      </w:pPr>
+      <w:r>
+        <w:br w:type="page"/>
+      </w:r>
+      <w:r>
+        <w:lastRenderedPageBreak/>
+        <w:t>ЗМІСТ</w:t>
+      </w:r>
+    </w:p>
+    <w:p>
+      <w:pPr>
+        <w:spacing w:line="360" w:lineRule="auto"/>
+        <w:jc w:val="both"/>
+        <w:rPr>
+          <w:sz w:val="28"/>
+          <w:szCs w:val="28"/>
+        </w:rPr>
+      </w:pPr>
+      <w:r>
+        <w:rPr>
+          <w:sz w:val="28"/>
+          <w:szCs w:val="28"/>
+        </w:rPr>
+        <w:t>Тестовий текст.</w:t>
+      </w:r>
+    </w:p>
+    <w:p>
+      <w:pPr>
+        <w:pStyle w:val="Heading1"/>
+      </w:pPr>
+      <w:r>
+        <w:br w:type="page"/>
+      </w:r>
+      <w:r>
+        <w:lastRenderedPageBreak/>
+        <w:t>ВСТУП</w:t>
+      </w:r>
+    </w:p>
+    <w:p>
+      <w:pPr>
+        <w:spacing w:line="360" w:lineRule="auto"/>
+        <w:jc w:val="both"/>
+        <w:rPr>
+          <w:sz w:val="28"/>
+          <w:szCs w:val="28"/>
+        </w:rPr>
+      </w:pPr>
+      <w:r>
+        <w:rPr>
+          <w:sz w:val="28"/>
+          <w:szCs w:val="28"/>
+        </w:rPr>
+        <w:t>Тестовий текст.</w:t>
+      </w:r>
+    </w:p>
+    <w:p>
+      <w:pPr>
+        <w:pStyle w:val="Heading1"/>
+      </w:pPr>
+      <w:r>
+        <w:br w:type="page"/>
+      </w:r>
+      <w:r>
+        <w:lastRenderedPageBreak/>
+        <w:t>ВИСНОВКИ</w:t>
+      </w:r>
+    </w:p>
+    <w:p>
+      <w:pPr>
+        <w:spacing w:line="360" w:lineRule="auto"/>
+        <w:jc w:val="both"/>
+        <w:rPr>
+          <w:sz w:val="28"/>
+          <w:szCs w:val="28"/>
+        </w:rPr>
+      </w:pPr>
+      <w:r>
+        <w:rPr>
+          <w:sz w:val="28"/>
+          <w:szCs w:val="28"/>
+        </w:rPr>
+        <w:t>Тестовий текст.</w:t>
+      </w:r>
+    </w:p>
+    <w:p>
+      <w:pPr>
+        <w:pStyle w:val="Heading1"/>
+      </w:pPr>
+      <w:r>
+        <w:br w:type="page"/>
+      </w:r>
+      <w:r>
+        <w:lastRenderedPageBreak/>
+        <w:t>СПИСОК ДЖЕРЕЛ ІНФОРМАЦІЇ</w:t>
+      </w:r>
+    </w:p>
+    <w:p>
+      <w:pPr>
+        <w:spacing w:line="360" w:lineRule="auto"/>
+        <w:jc w:val="both"/>
+        <w:rPr>
+          <w:sz w:val="28"/>
+          <w:szCs w:val="28"/>
+        </w:rPr>
+      </w:pPr>
+      <w:r>
+        <w:rPr>
+          <w:sz w:val="28"/>
+          <w:szCs w:val="28"/>
+        </w:rPr>
+        <w:t>Тестовий текст.</w:t>
       </w:r>
     </w:p>
     <w:sectPr>
@@ -2135,9 +2251,9 @@
     <w:basedOn w:val="Normal"/>
     <w:uiPriority w:val="9"/>
     <w:qFormat/>
+    <w:rsid w:val="003E6D35"/>
     <w:pPr>
-      <w:spacing w:before="89"/>
-      <w:ind w:left="739" w:right="424"/>
+      <w:spacing w:line="360" w:lineRule="auto"/>
       <w:jc w:val="center"/>
       <w:outlineLvl w:val="0"/>
     </w:pPr>

</xml_diff>

<commit_message>
TC-58: added checking of the location of structural elements in the d… (#57)
* TC-58: added checking of the location of structural elements in the document

* TC-58: refactoring util

* TC-58: refactoring util

* TC-58: make some methods static for use in other checks

* TC-58: refactoring/create documents for tests

* TC-58: refactoring and added new methods for check structured elements

* TC-58: refactoring

* TC-58: refactoring

* TC-58: remove unused method

* TC-58: remove import

* TC-58: Removing redundant functionality that should be separated into other tasks

* TC-58: remove static modificator

* TC-58: added checker in list of checkers

* TC-58: refactoring
</commit_message>
<xml_diff>
--- a/java-thesis-checker/src/test/resources/inherited_styles.docx
+++ b/java-thesis-checker/src/test/resources/inherited_styles.docx
@@ -520,6 +520,122 @@
           <w:szCs w:val="28"/>
         </w:rPr>
         <w:t>-режимі.</w:t>
+      </w:r>
+    </w:p>
+    <w:p>
+      <w:pPr>
+        <w:pStyle w:val="Heading1"/>
+      </w:pPr>
+      <w:r>
+        <w:br w:type="page"/>
+      </w:r>
+      <w:r>
+        <w:lastRenderedPageBreak/>
+        <w:t>ЗМІСТ</w:t>
+      </w:r>
+    </w:p>
+    <w:p>
+      <w:pPr>
+        <w:spacing w:line="360" w:lineRule="auto"/>
+        <w:jc w:val="both"/>
+        <w:rPr>
+          <w:sz w:val="28"/>
+          <w:szCs w:val="28"/>
+        </w:rPr>
+      </w:pPr>
+      <w:r>
+        <w:rPr>
+          <w:sz w:val="28"/>
+          <w:szCs w:val="28"/>
+        </w:rPr>
+        <w:t>Тестовий текст.</w:t>
+      </w:r>
+    </w:p>
+    <w:p>
+      <w:pPr>
+        <w:pStyle w:val="Heading1"/>
+      </w:pPr>
+      <w:r>
+        <w:br w:type="page"/>
+      </w:r>
+      <w:r>
+        <w:lastRenderedPageBreak/>
+        <w:t>ВСТУП</w:t>
+      </w:r>
+    </w:p>
+    <w:p>
+      <w:pPr>
+        <w:spacing w:line="360" w:lineRule="auto"/>
+        <w:jc w:val="both"/>
+        <w:rPr>
+          <w:sz w:val="28"/>
+          <w:szCs w:val="28"/>
+        </w:rPr>
+      </w:pPr>
+      <w:r>
+        <w:rPr>
+          <w:sz w:val="28"/>
+          <w:szCs w:val="28"/>
+        </w:rPr>
+        <w:t>Тестовий текст.</w:t>
+      </w:r>
+    </w:p>
+    <w:p>
+      <w:pPr>
+        <w:pStyle w:val="Heading1"/>
+      </w:pPr>
+      <w:r>
+        <w:br w:type="page"/>
+      </w:r>
+      <w:r>
+        <w:lastRenderedPageBreak/>
+        <w:t>ВИСНОВКИ</w:t>
+      </w:r>
+    </w:p>
+    <w:p>
+      <w:pPr>
+        <w:spacing w:line="360" w:lineRule="auto"/>
+        <w:jc w:val="both"/>
+        <w:rPr>
+          <w:sz w:val="28"/>
+          <w:szCs w:val="28"/>
+        </w:rPr>
+      </w:pPr>
+      <w:r>
+        <w:rPr>
+          <w:sz w:val="28"/>
+          <w:szCs w:val="28"/>
+        </w:rPr>
+        <w:t>Тестовий текст.</w:t>
+      </w:r>
+    </w:p>
+    <w:p>
+      <w:pPr>
+        <w:pStyle w:val="Heading1"/>
+      </w:pPr>
+      <w:r>
+        <w:br w:type="page"/>
+      </w:r>
+      <w:r>
+        <w:lastRenderedPageBreak/>
+        <w:t>СПИСОК ДЖЕРЕЛ ІНФОРМАЦІЇ</w:t>
+      </w:r>
+    </w:p>
+    <w:p>
+      <w:pPr>
+        <w:spacing w:line="360" w:lineRule="auto"/>
+        <w:jc w:val="both"/>
+        <w:rPr>
+          <w:sz w:val="28"/>
+          <w:szCs w:val="28"/>
+        </w:rPr>
+      </w:pPr>
+      <w:r>
+        <w:rPr>
+          <w:sz w:val="28"/>
+          <w:szCs w:val="28"/>
+        </w:rPr>
+        <w:t>Тестовий текст.</w:t>
       </w:r>
     </w:p>
     <w:sectPr>
@@ -2135,9 +2251,9 @@
     <w:basedOn w:val="Normal"/>
     <w:uiPriority w:val="9"/>
     <w:qFormat/>
+    <w:rsid w:val="003E6D35"/>
     <w:pPr>
-      <w:spacing w:before="89"/>
-      <w:ind w:left="739" w:right="424"/>
+      <w:spacing w:line="360" w:lineRule="auto"/>
       <w:jc w:val="center"/>
       <w:outlineLvl w:val="0"/>
     </w:pPr>

</xml_diff>